<commit_message>
Modul Word Opto P1: nomor+caption tabel, kutipan tabel, dan pembaruan referensi (#636)
Setiap tabel kini punya "Tabel N. <caption>" di atasnya (konvensi APA,
berkebalikan dari gambar) dan disitasi eksplisit pada paragraf pengantar.
Font pada ilustrasi diperkecil sedikit dan dirapikan (legend aliasing,
label donut scoring, kekompakan roadmap) tanpa mengubah skala 1:1 thd
teks modul. Ruang kosong yang muncul akibat penambahan konten diisi
dengan paragraf penjelasan tambahan yang relevan secara substansi.
Daftar Pustaka diganti total dengan 7 referensi terverifikasi (≤10 tahun,
5 di antaranya jurnal internasional ber-DOI/link) menggantikan referensi
lama yang sudah lebih dari 10 tahun.


Claude-Session: https://claude.ai/code/session_01MRPE2Wfn5ruEpMsNER92uG

Co-authored-by: Claude <noreply@anthropic.com>
</commit_message>
<xml_diff>
--- a/Optimalisasi-dan-Automasi/Modul-Word/Modul-1-Pengantar-Time-Series-Data.docx
+++ b/Optimalisasi-dan-Automasi/Modul-Word/Modul-1-Pengantar-Time-Series-Data.docx
@@ -2667,7 +2667,7 @@
       <w:r>
         <w:drawing>
           <wp:inline xmlns:a="http://schemas.openxmlformats.org/drawingml/2006/main" xmlns:pic="http://schemas.openxmlformats.org/drawingml/2006/picture">
-            <wp:extent cx="4258800" cy="4441617"/>
+            <wp:extent cx="3895200" cy="3699816"/>
             <wp:docPr id="1858245148" name="Picture 1858245148"/>
             <wp:cNvGraphicFramePr>
               <a:graphicFrameLocks noChangeAspect="1"/>
@@ -2688,7 +2688,7 @@
                   <pic:spPr>
                     <a:xfrm>
                       <a:off x="0" y="0"/>
-                      <a:ext cx="4258800" cy="4441617"/>
+                      <a:ext cx="3895200" cy="3699816"/>
                     </a:xfrm>
                     <a:prstGeom prst="rect"/>
                   </pic:spPr>
@@ -2897,7 +2897,7 @@
       <w:r>
         <w:drawing>
           <wp:inline xmlns:a="http://schemas.openxmlformats.org/drawingml/2006/main" xmlns:pic="http://schemas.openxmlformats.org/drawingml/2006/picture">
-            <wp:extent cx="4683600" cy="3312182"/>
+            <wp:extent cx="4456800" cy="3155515"/>
             <wp:docPr id="1858245149" name="Picture 1858245149"/>
             <wp:cNvGraphicFramePr>
               <a:graphicFrameLocks noChangeAspect="1"/>
@@ -2918,7 +2918,7 @@
                   <pic:spPr>
                     <a:xfrm>
                       <a:off x="0" y="0"/>
-                      <a:ext cx="4683600" cy="3312182"/>
+                      <a:ext cx="4456800" cy="3155515"/>
                     </a:xfrm>
                     <a:prstGeom prst="rect"/>
                   </pic:spPr>
@@ -3215,6 +3215,52 @@
           <w:sz w:val="22"/>
         </w:rPr>
         <w:t>sisa acak setelah tren, musiman, dan siklik dipisahkan; idealnya white noise εt ~ N(0, σ²): mean nol, varians konstan, tanpa autokorelasi. Anomali nyata muncul sebagai residual besar yang menyimpang dari distribusi normalnya (lihat panel terbawah Gambar 3).</w:t>
+      </w:r>
+    </w:p>
+    <w:p>
+      <w:pPr>
+        <w:spacing w:line="360" w:lineRule="auto" w:after="120"/>
+        <w:jc w:val="both"/>
+      </w:pPr>
+      <w:r>
+        <w:rPr>
+          <w:rFonts w:ascii="Arial" w:hAnsi="Arial" w:cs="Arial"/>
+          <w:b w:val="0"/>
+          <w:i w:val="0"/>
+          <w:sz w:val="22"/>
+        </w:rPr>
+        <w:t>Tabel 1 merangkum keempat komponen tersebut sekaligus, lengkap dengan periode khasnya, contoh kemunculan di industri, dan metode deteksi yang lazim dipakai untuk masing-masing.</w:t>
+      </w:r>
+    </w:p>
+    <w:p>
+      <w:pPr>
+        <w:spacing w:line="360" w:lineRule="auto" w:after="120"/>
+        <w:jc w:val="both"/>
+      </w:pPr>
+      <w:r>
+        <w:rPr>
+          <w:rFonts w:ascii="Arial" w:hAnsi="Arial" w:cs="Arial"/>
+          <w:b w:val="0"/>
+          <w:i w:val="0"/>
+          <w:sz w:val="22"/>
+        </w:rPr>
+        <w:t>Kesalahan yang sering terjadi di lapangan adalah menganggap kenaikan sebuah statistik sebagai anomali tunggal, padahal sesungguhnya gabungan dua komponen berbeda yang kebetulan naik bersamaan. Misalnya, RMS getaran yang meningkat menjelang akhir shift malam bisa jadi bukan indikasi kerusakan, melainkan superposisi tren aus bearing dengan pola musiman beban produksi yang memang lebih tinggi pada jam tersebut. Tanpa dekomposisi, engineer berisiko menjadwalkan maintenance yang tidak perlu, atau mengabaikan tren aus yang sesungguhnya sedang berlangsung.</w:t>
+      </w:r>
+    </w:p>
+    <w:p>
+      <w:pPr>
+        <w:keepNext/>
+        <w:spacing w:before="160" w:after="80"/>
+      </w:pPr>
+      <w:r>
+        <w:rPr>
+          <w:rFonts w:ascii="Arial" w:hAnsi="Arial" w:cs="Arial"/>
+          <w:b w:val="0"/>
+          <w:i/>
+          <w:color w:val="444444"/>
+          <w:sz w:val="20"/>
+        </w:rPr>
+        <w:t>Tabel 1. Empat komponen sinyal time series beserta periode, contoh industri, dan cara deteksinya.</w:t>
       </w:r>
     </w:p>
     <w:tbl>
@@ -3669,7 +3715,7 @@
       <w:r>
         <w:drawing>
           <wp:inline xmlns:a="http://schemas.openxmlformats.org/drawingml/2006/main" xmlns:pic="http://schemas.openxmlformats.org/drawingml/2006/picture">
-            <wp:extent cx="5047200" cy="5941062"/>
+            <wp:extent cx="4928400" cy="5825983"/>
             <wp:docPr id="1858245150" name="Picture 1858245150"/>
             <wp:cNvGraphicFramePr>
               <a:graphicFrameLocks noChangeAspect="1"/>
@@ -3690,7 +3736,7 @@
                   <pic:spPr>
                     <a:xfrm>
                       <a:off x="0" y="0"/>
-                      <a:ext cx="5047200" cy="5941062"/>
+                      <a:ext cx="4928400" cy="5825983"/>
                     </a:xfrm>
                     <a:prstGeom prst="rect"/>
                   </pic:spPr>
@@ -3957,6 +4003,52 @@
           <w:sz w:val="22"/>
         </w:rPr>
         <w:t>Sebuah motor 15 kW yang sehat menghasilkan sinyal getaran dengan RMS ≈ 0,45 mm/s dan Peak ≈ 0,9 mm/s, sehingga Crest Factor ≈ 2,0, khas untuk sinyal harmonik normal tanpa impulsive fault. Ketika bearing mulai spalling, Peak melonjak menjadi ≈ 3,2 mm/s sementara RMS hanya naik ke ≈ 0,52 mm/s; Crest Factor pun melonjak ke ≈ 6,2, jauh di atas ambang batas 4. Inilah sebabnya Crest Factor jauh lebih sensitif sebagai indikator dini kerusakan bearing dibanding RMS saja, yang justru menjadi metrik utama menurut ISO 10816.</w:t>
+      </w:r>
+    </w:p>
+    <w:p>
+      <w:pPr>
+        <w:spacing w:line="360" w:lineRule="auto" w:after="120"/>
+        <w:jc w:val="both"/>
+      </w:pPr>
+      <w:r>
+        <w:rPr>
+          <w:rFonts w:ascii="Arial" w:hAnsi="Arial" w:cs="Arial"/>
+          <w:b w:val="0"/>
+          <w:i w:val="0"/>
+          <w:sz w:val="22"/>
+        </w:rPr>
+        <w:t>Kelima statistik di atas dirangkum pada Tabel 2, dipetakan terhadap apa yang masing-masing sensitif deteksi, aplikasi tipikalnya, dan jenis kerusakan mesin yang paling relevan.</w:t>
+      </w:r>
+    </w:p>
+    <w:p>
+      <w:pPr>
+        <w:spacing w:line="360" w:lineRule="auto" w:after="120"/>
+        <w:jc w:val="both"/>
+      </w:pPr>
+      <w:r>
+        <w:rPr>
+          <w:rFonts w:ascii="Arial" w:hAnsi="Arial" w:cs="Arial"/>
+          <w:b w:val="0"/>
+          <w:i w:val="0"/>
+          <w:sz w:val="22"/>
+        </w:rPr>
+        <w:t>Dalam praktiknya kelima statistik ini jarang dipakai sendiri-sendiri; dashboard condition monitoring modern menghitung semuanya sekaligus pada setiap window data yang masuk, lalu menampilkannya sebagai trend chart berdampingan. Mean dan RMS memantau kondisi umum, sementara Crest Factor menjadi early warning khusus untuk fault impulsive seperti spalling yang belum tentu terlihat dari RMS saja. Standar deviasi membantu membedakan mesin yang stabil dari mesin yang mulai tidak menentu, bahkan sebelum nilai rata-ratanya bergeser signifikan.</w:t>
+      </w:r>
+    </w:p>
+    <w:p>
+      <w:pPr>
+        <w:keepNext/>
+        <w:spacing w:before="160" w:after="80"/>
+      </w:pPr>
+      <w:r>
+        <w:rPr>
+          <w:rFonts w:ascii="Arial" w:hAnsi="Arial" w:cs="Arial"/>
+          <w:b w:val="0"/>
+          <w:i/>
+          <w:color w:val="444444"/>
+          <w:sz w:val="20"/>
+        </w:rPr>
+        <w:t>Tabel 2. Lima statistik dasar time series, sensitivitasnya, aplikasi, dan tipe kerusakan yang terdeteksi.</w:t>
       </w:r>
     </w:p>
     <w:tbl>
@@ -4496,7 +4588,7 @@
       <w:r>
         <w:drawing>
           <wp:inline xmlns:a="http://schemas.openxmlformats.org/drawingml/2006/main" xmlns:pic="http://schemas.openxmlformats.org/drawingml/2006/picture">
-            <wp:extent cx="4255200" cy="3087513"/>
+            <wp:extent cx="3960000" cy="2929486"/>
             <wp:docPr id="1858245151" name="Picture 1858245151"/>
             <wp:cNvGraphicFramePr>
               <a:graphicFrameLocks noChangeAspect="1"/>
@@ -4517,7 +4609,7 @@
                   <pic:spPr>
                     <a:xfrm>
                       <a:off x="0" y="0"/>
-                      <a:ext cx="4255200" cy="3087513"/>
+                      <a:ext cx="3960000" cy="2929486"/>
                     </a:xfrm>
                     <a:prstGeom prst="rect"/>
                   </pic:spPr>
@@ -4776,6 +4868,37 @@
           <w:sz w:val="22"/>
         </w:rPr>
         <w:t>Sebuah pabrik pernah men-sampling getaran motor pada 2 kHz karena mengasumsikan frekuensi tertinggi yang relevan hanya 1 kHz; belakangan diketahui bearing fault BPFO mesin tersebut sebenarnya berada di 1,4 kHz, DI ATAS frekuensi Nyquist 1 kHz. Akibatnya sinyal fault teralias dan tidak pernah terdeteksi selama delapan bulan hingga terjadi kegagalan katastropik. Setelah sampling rate dinaikkan ke 10 kHz (margin sekitar 7× di atas BPFO), fault serupa pada mesin sejenis berhasil terdeteksi tiga minggu sebelum kegagalan pada siklus monitoring berikutnya.</w:t>
+      </w:r>
+    </w:p>
+    <w:p>
+      <w:pPr>
+        <w:spacing w:line="360" w:lineRule="auto" w:after="120"/>
+        <w:jc w:val="both"/>
+      </w:pPr>
+      <w:r>
+        <w:rPr>
+          <w:rFonts w:ascii="Arial" w:hAnsi="Arial" w:cs="Arial"/>
+          <w:b w:val="0"/>
+          <w:i w:val="0"/>
+          <w:sz w:val="22"/>
+        </w:rPr>
+        <w:t>Tabel 3 membandingkan rentang frekuensi sinyal dan sampling rate tipikal untuk lima kelompok aplikasi sensor industri yang paling umum dijumpai di lapangan.</w:t>
+      </w:r>
+    </w:p>
+    <w:p>
+      <w:pPr>
+        <w:keepNext/>
+        <w:spacing w:before="160" w:after="80"/>
+      </w:pPr>
+      <w:r>
+        <w:rPr>
+          <w:rFonts w:ascii="Arial" w:hAnsi="Arial" w:cs="Arial"/>
+          <w:b w:val="0"/>
+          <w:i/>
+          <w:color w:val="444444"/>
+          <w:sz w:val="20"/>
+        </w:rPr>
+        <w:t>Tabel 3. Rentang frekuensi sinyal dan sampling rate tipikal per aplikasi sensor industri.</w:t>
       </w:r>
     </w:p>
     <w:tbl>
@@ -5315,7 +5438,7 @@
       <w:r>
         <w:drawing>
           <wp:inline xmlns:a="http://schemas.openxmlformats.org/drawingml/2006/main" xmlns:pic="http://schemas.openxmlformats.org/drawingml/2006/picture">
-            <wp:extent cx="4410000" cy="3329322"/>
+            <wp:extent cx="4338000" cy="3635776"/>
             <wp:docPr id="1858245152" name="Picture 1858245152"/>
             <wp:cNvGraphicFramePr>
               <a:graphicFrameLocks noChangeAspect="1"/>
@@ -5336,7 +5459,7 @@
                   <pic:spPr>
                     <a:xfrm>
                       <a:off x="0" y="0"/>
-                      <a:ext cx="4410000" cy="3329322"/>
+                      <a:ext cx="4338000" cy="3635776"/>
                     </a:xfrm>
                     <a:prstGeom prst="rect"/>
                   </pic:spPr>
@@ -5427,6 +5550,21 @@
     </w:p>
     <w:p>
       <w:pPr>
+        <w:spacing w:line="360" w:lineRule="auto" w:after="120"/>
+        <w:jc w:val="both"/>
+      </w:pPr>
+      <w:r>
+        <w:rPr>
+          <w:rFonts w:ascii="Arial" w:hAnsi="Arial" w:cs="Arial"/>
+          <w:b w:val="0"/>
+          <w:i w:val="0"/>
+          <w:sz w:val="22"/>
+        </w:rPr>
+        <w:t>Analogi-analogi ini sengaja dipilih dari aktivitas yang hampir setiap mahasiswa alami sehari-hari, seperti memotret dengan HP atau mendengarkan musik streaming, karena konsep sampling rate dan aliasing sering terasa abstrak ketika pertama kali dipelajari lewat rumus semata. Dengan mengaitkan fN = fs/2 pada burst mode kamera, atau RMS pada normalisasi volume Spotify, mahasiswa dapat membangun intuisi fisik terlebih dahulu sebelum kembali ke notasi matematis yang lebih formal.</w:t>
+      </w:r>
+    </w:p>
+    <w:p>
+      <w:pPr>
         <w:keepNext/>
         <w:spacing w:before="120" w:after="40"/>
         <w:jc w:val="center"/>
@@ -5434,7 +5572,7 @@
       <w:r>
         <w:drawing>
           <wp:inline xmlns:a="http://schemas.openxmlformats.org/drawingml/2006/main" xmlns:pic="http://schemas.openxmlformats.org/drawingml/2006/picture">
-            <wp:extent cx="5018400" cy="3417667"/>
+            <wp:extent cx="4903200" cy="3303427"/>
             <wp:docPr id="1858245153" name="Picture 1858245153"/>
             <wp:cNvGraphicFramePr>
               <a:graphicFrameLocks noChangeAspect="1"/>
@@ -5455,7 +5593,7 @@
                   <pic:spPr>
                     <a:xfrm>
                       <a:off x="0" y="0"/>
-                      <a:ext cx="5018400" cy="3417667"/>
+                      <a:ext cx="4903200" cy="3303427"/>
                     </a:xfrm>
                     <a:prstGeom prst="rect"/>
                   </pic:spPr>
@@ -5727,7 +5865,7 @@
       <w:r>
         <w:drawing>
           <wp:inline xmlns:a="http://schemas.openxmlformats.org/drawingml/2006/main" xmlns:pic="http://schemas.openxmlformats.org/drawingml/2006/picture">
-            <wp:extent cx="4543200" cy="3416752"/>
+            <wp:extent cx="4402800" cy="3251170"/>
             <wp:docPr id="1858245154" name="Picture 1858245154"/>
             <wp:cNvGraphicFramePr>
               <a:graphicFrameLocks noChangeAspect="1"/>
@@ -5748,7 +5886,7 @@
                   <pic:spPr>
                     <a:xfrm>
                       <a:off x="0" y="0"/>
-                      <a:ext cx="4543200" cy="3416752"/>
+                      <a:ext cx="4402800" cy="3251170"/>
                     </a:xfrm>
                     <a:prstGeom prst="rect"/>
                   </pic:spPr>
@@ -6666,7 +6804,7 @@
       <w:r>
         <w:drawing>
           <wp:inline xmlns:a="http://schemas.openxmlformats.org/drawingml/2006/main" xmlns:pic="http://schemas.openxmlformats.org/drawingml/2006/picture">
-            <wp:extent cx="4676400" cy="3712022"/>
+            <wp:extent cx="4564800" cy="3600288"/>
             <wp:docPr id="1858245155" name="Picture 1858245155"/>
             <wp:cNvGraphicFramePr>
               <a:graphicFrameLocks noChangeAspect="1"/>
@@ -6687,7 +6825,7 @@
                   <pic:spPr>
                     <a:xfrm>
                       <a:off x="0" y="0"/>
-                      <a:ext cx="4676400" cy="3712022"/>
+                      <a:ext cx="4564800" cy="3600288"/>
                     </a:xfrm>
                     <a:prstGeom prst="rect"/>
                   </pic:spPr>
@@ -6985,7 +7123,7 @@
       <w:r>
         <w:drawing>
           <wp:inline xmlns:a="http://schemas.openxmlformats.org/drawingml/2006/main" xmlns:pic="http://schemas.openxmlformats.org/drawingml/2006/picture">
-            <wp:extent cx="4467600" cy="2867575"/>
+            <wp:extent cx="4482000" cy="2831393"/>
             <wp:docPr id="1858245156" name="Picture 1858245156"/>
             <wp:cNvGraphicFramePr>
               <a:graphicFrameLocks noChangeAspect="1"/>
@@ -7006,7 +7144,7 @@
                   <pic:spPr>
                     <a:xfrm>
                       <a:off x="0" y="0"/>
-                      <a:ext cx="4467600" cy="2867575"/>
+                      <a:ext cx="4482000" cy="2831393"/>
                     </a:xfrm>
                     <a:prstGeom prst="rect"/>
                   </pic:spPr>
@@ -10073,7 +10211,17 @@
           <w:i w:val="0"/>
           <w:sz w:val="22"/>
         </w:rPr>
-        <w:t>Box, G. E. P., &amp; Cox, D. R. (1964). An analysis of transformations. Journal of the Royal Statistical Society: Series B (Methodological), 26(2), 211–252.</w:t>
+        <w:t>Altaf, M., Akram, T., Khan, M. A., Iqbal, M., Ch, M. M. I., &amp; Hsu, C.-H. (2022). A new statistical features based approach for bearing fault diagnosis using vibration signals. Sensors, 22(5), 2012.</w:t>
+      </w:r>
+      <w:r>
+        <w:rPr>
+          <w:rFonts w:ascii="Arial" w:hAnsi="Arial" w:cs="Arial"/>
+          <w:b w:val="0"/>
+          <w:i w:val="0"/>
+          <w:color w:val="0563C1"/>
+          <w:sz w:val="21"/>
+        </w:rPr>
+        <w:t xml:space="preserve"> https://doi.org/10.3390/s22052012</w:t>
       </w:r>
     </w:p>
     <w:p>
@@ -10088,7 +10236,17 @@
           <w:i w:val="0"/>
           <w:sz w:val="22"/>
         </w:rPr>
-        <w:t>Cleveland, R. B., Cleveland, W. S., McRae, J. E., &amp; Terpenning, I. (1990). STL: A seasonal-trend decomposition procedure based on loess. Journal of Official Statistics, 6(1), 3–73.</w:t>
+        <w:t>Dudek, G. (2023). STD: A seasonal-trend-dispersion decomposition of time series. IEEE Transactions on Knowledge and Data Engineering, 35(10), 10339–10350.</w:t>
+      </w:r>
+      <w:r>
+        <w:rPr>
+          <w:rFonts w:ascii="Arial" w:hAnsi="Arial" w:cs="Arial"/>
+          <w:b w:val="0"/>
+          <w:i w:val="0"/>
+          <w:color w:val="0563C1"/>
+          <w:sz w:val="21"/>
+        </w:rPr>
+        <w:t xml:space="preserve"> https://doi.org/10.1109/TKDE.2023.3268125</w:t>
       </w:r>
     </w:p>
     <w:p>
@@ -10128,7 +10286,17 @@
           <w:i w:val="0"/>
           <w:sz w:val="22"/>
         </w:rPr>
-        <w:t>Mohanty, A. R. (2015). Machinery condition monitoring: Principles and practices. CRC Press.</w:t>
+        <w:t>Romanssini, M., de Aguirre, P. C. C., Compassi-Severo, L., &amp; Girardi, A. G. (2023). A review on vibration monitoring techniques for predictive maintenance of rotating machinery. Eng, 4(3), 1797–1817.</w:t>
+      </w:r>
+      <w:r>
+        <w:rPr>
+          <w:rFonts w:ascii="Arial" w:hAnsi="Arial" w:cs="Arial"/>
+          <w:b w:val="0"/>
+          <w:i w:val="0"/>
+          <w:color w:val="0563C1"/>
+          <w:sz w:val="21"/>
+        </w:rPr>
+        <w:t xml:space="preserve"> https://doi.org/10.3390/eng4030102</w:t>
       </w:r>
     </w:p>
     <w:p>
@@ -10143,7 +10311,7 @@
           <w:i w:val="0"/>
           <w:sz w:val="22"/>
         </w:rPr>
-        <w:t>Seabold, S., &amp; Perktold, J. (2010). Statsmodels: Econometric and statistical modeling with Python. Proceedings of the 9th Python in Science Conference, 92–96.</w:t>
+        <w:t>Tiboni, M., Remino, C., Bussola, R., &amp; Amici, C. (2022). A review on vibration-based condition monitoring of rotating machinery. Applied Sciences, 12(3), 972.</w:t>
       </w:r>
       <w:r>
         <w:rPr>
@@ -10153,7 +10321,7 @@
           <w:color w:val="0563C1"/>
           <w:sz w:val="21"/>
         </w:rPr>
-        <w:t xml:space="preserve"> https://www.statsmodels.org/stable/tsa.html</w:t>
+        <w:t xml:space="preserve"> https://doi.org/10.3390/app12030972</w:t>
       </w:r>
     </w:p>
     <w:p>
@@ -10168,7 +10336,7 @@
           <w:i w:val="0"/>
           <w:sz w:val="22"/>
         </w:rPr>
-        <w:t>Pedregosa, F., et al. (2011). Scikit-learn: Machine learning in Python. Journal of Machine Learning Research, 12, 2825–2830.</w:t>
+        <w:t>Ul Hassan, I., Panduru, K., &amp; Walsh, J. (2024). An in-depth study of vibration sensors for condition monitoring. Sensors, 24(3), 740.</w:t>
       </w:r>
       <w:r>
         <w:rPr>
@@ -10178,7 +10346,32 @@
           <w:color w:val="0563C1"/>
           <w:sz w:val="21"/>
         </w:rPr>
-        <w:t xml:space="preserve"> https://scikit-learn.org/stable/modules/preprocessing.html</w:t>
+        <w:t xml:space="preserve"> https://doi.org/10.3390/s24030740</w:t>
+      </w:r>
+    </w:p>
+    <w:p>
+      <w:pPr>
+        <w:spacing w:line="360" w:lineRule="auto" w:after="120"/>
+        <w:ind w:left="567" w:hanging="567"/>
+      </w:pPr>
+      <w:r>
+        <w:rPr>
+          <w:rFonts w:ascii="Arial" w:hAnsi="Arial" w:cs="Arial"/>
+          <w:b w:val="0"/>
+          <w:i w:val="0"/>
+          <w:sz w:val="22"/>
+        </w:rPr>
+        <w:t>Zeng, A., Chen, M., Zhang, L., &amp; Xu, Q. (2023). Are transformers effective for time series forecasting? Proceedings of the AAAI Conference on Artificial Intelligence, 37(9), 11121–11128.</w:t>
+      </w:r>
+      <w:r>
+        <w:rPr>
+          <w:rFonts w:ascii="Arial" w:hAnsi="Arial" w:cs="Arial"/>
+          <w:b w:val="0"/>
+          <w:i w:val="0"/>
+          <w:color w:val="0563C1"/>
+          <w:sz w:val="21"/>
+        </w:rPr>
+        <w:t xml:space="preserve"> https://doi.org/10.1609/aaai.v37i9.26317</w:t>
       </w:r>
     </w:p>
     <w:sectPr>

</xml_diff>

<commit_message>
Modul Word Opto P1: tambah konten pengisi ruang kosong setelah Gambar 2/Tabel 2/Tabel 3 (#637)
Menambahkan paragraf substantif (bukan padding kosong) di 3 titik yang
dilaporkan masih menyisakan ruang kosong besar: sebelum Gambar 2 (aspek
ekonomi pemilihan sensor, terkait Sub-CPMK 1.1), setelah Tabel 2 sebelum
Gambar 4 (transisi ke simulasi impulsive event), dan setelah Tabel 3
sebelum Gambar 5 (trade-off biaya sampling rate). Simulator pagination
heuristik di environment ini terbukti tidak akurat memprediksi lokasi
dan besar celah dibanding rendering Word sesungguhnya (LibreOffice
headless tetap tidak berfungsi setelah diuji ulang), sehingga perbaikan
kali ini mengandalkan konfirmasi visual langsung dari pengguna.

Co-authored-by: Claude <noreply@anthropic.com>
</commit_message>
<xml_diff>
--- a/Optimalisasi-dan-Automasi/Modul-Word/Modul-1-Pengantar-Time-Series-Data.docx
+++ b/Optimalisasi-dan-Automasi/Modul-Word/Modul-1-Pengantar-Time-Series-Data.docx
@@ -2886,6 +2886,21 @@
           <w:sz w:val="22"/>
         </w:rPr>
         <w:t>Mesin industri modern memiliki ratusan sensor: akselerometer (getaran), termokopel (suhu), strain gauge (regangan), sensor arus motor, dan sensor tekanan oli. Semuanya menghasilkan time series. Frekuensi sampling menentukan resolusi data: getaran high-speed bisa memerlukan 10 kHz, suhu cukup 1 Hz, dan kondisi proses cukup satu sampel per menit. Periode sampling dirumuskan Δt = 1/fs. Gambar 2 menunjukkan contoh sinyal getaran sintetis hasil superposisi tiga komponen frekuensi ditambah noise, yaitu pola yang tipikal terekam akselerometer pada motor industri.</w:t>
+      </w:r>
+    </w:p>
+    <w:p>
+      <w:pPr>
+        <w:spacing w:line="360" w:lineRule="auto" w:after="120"/>
+        <w:jc w:val="both"/>
+      </w:pPr>
+      <w:r>
+        <w:rPr>
+          <w:rFonts w:ascii="Arial" w:hAnsi="Arial" w:cs="Arial"/>
+          <w:b w:val="0"/>
+          <w:i w:val="0"/>
+          <w:sz w:val="22"/>
+        </w:rPr>
+        <w:t>Pemilihan jenis sensor juga mempertimbangkan aspek ekonomi: akselerometer piezoelectric presisi tinggi untuk vibration monitoring bisa berharga jutaan rupiah per unit ditambah biaya instalasi dan kalibrasi berkala, sedangkan termokopel tipe K jauh lebih murah dan tahan lingkungan panas ekstrem. Pada sistem dengan puluhan hingga ratusan titik ukur, keputusan menempatkan sensor mahal hanya pada komponen kritis seperti bearing utama dan gearbox, sementara komponen sekunder cukup dipantau tidak langsung, adalah trade-off ekonomi khas yang akan terus muncul sepanjang mata kuliah ini.</w:t>
       </w:r>
     </w:p>
     <w:p>
@@ -4581,6 +4596,21 @@
     </w:p>
     <w:p>
       <w:pPr>
+        <w:spacing w:line="360" w:lineRule="auto" w:after="120"/>
+        <w:jc w:val="both"/>
+      </w:pPr>
+      <w:r>
+        <w:rPr>
+          <w:rFonts w:ascii="Arial" w:hAnsi="Arial" w:cs="Arial"/>
+          <w:b w:val="0"/>
+          <w:i w:val="0"/>
+          <w:sz w:val="22"/>
+        </w:rPr>
+        <w:t>Untuk melihat bagaimana kelima statistik ini bereaksi terhadap kejadian nyata di lapangan, perhatikan simulasi pada Gambar 4: satu impulsive event tunggal yang mewakili awal spalling pada elemen bearing disisipkan ke tengah sinyal getaran yang sebelumnya stabil. Perhatikan bagaimana Peak melonjak drastis pada saat kejadian tersebut, sementara RMS keseluruhan sinyal nyaris tidak berubah karena durasi impulsive event yang sangat singkat dibanding total durasi jendela pengukuran. Fenomena inilah yang membuat RMS saja sering kali terlambat mendeteksi kerusakan tahap awal, sedangkan Crest Factor yang membandingkan Peak terhadap RMS jauh lebih sensitif terhadap sinyal impulsive semacam ini.</w:t>
+      </w:r>
+    </w:p>
+    <w:p>
+      <w:pPr>
         <w:keepNext/>
         <w:spacing w:before="120" w:after="40"/>
         <w:jc w:val="center"/>
@@ -5428,6 +5458,21 @@
       <w:pPr>
         <w:spacing w:after="80"/>
       </w:pPr>
+    </w:p>
+    <w:p>
+      <w:pPr>
+        <w:spacing w:line="360" w:lineRule="auto" w:after="120"/>
+        <w:jc w:val="both"/>
+      </w:pPr>
+      <w:r>
+        <w:rPr>
+          <w:rFonts w:ascii="Arial" w:hAnsi="Arial" w:cs="Arial"/>
+          <w:b w:val="0"/>
+          <w:i w:val="0"/>
+          <w:sz w:val="22"/>
+        </w:rPr>
+        <w:t>Kolom terakhir Tabel 3 memberi catatan praktis, namun keputusan akhir tetap bergantung konteks operasional: pabrik dengan anggaran terbatas mungkin memilih titik terendah dari rentang yang direkomendasikan untuk menghemat biaya storage dan bandwidth jaringan, sementara aplikasi safety-critical seperti bearing high-speed pada turbin justru disarankan memilih titik tertinggi demi margin keamanan ekstra. Perbandingan biaya-manfaat semacam ini adalah inti dari Sub-CPMK 1.1 pertemuan ini: sampling rate bukan sekadar parameter teknis, melainkan keputusan bisnis yang memengaruhi total cost of ownership sistem monitoring.</w:t>
+      </w:r>
     </w:p>
     <w:p>
       <w:pPr>

</xml_diff>